<commit_message>
fixed pivots and joins
</commit_message>
<xml_diff>
--- a/docs/content/joins/joins_activity.docx
+++ b/docs/content/joins/joins_activity.docx
@@ -411,18 +411,6 @@
         </w:numPr>
       </w:pPr>
       <w:r>
-        <w:t xml:space="preserve">Recognize the accidental-key join — the bug that runs without an error</w:t>
-      </w:r>
-    </w:p>
-    <w:p>
-      <w:pPr>
-        <w:pStyle w:val="Compact"/>
-        <w:numPr>
-          <w:ilvl w:val="0"/>
-          <w:numId w:val="1001"/>
-        </w:numPr>
-      </w:pPr>
-      <w:r>
         <w:t xml:space="preserve">Build one analysis-ready table</w:t>
       </w:r>
     </w:p>
@@ -1951,7 +1939,7 @@
         <w:pStyle w:val="BlockText"/>
       </w:pPr>
       <w:r>
-        <w:t xml:space="preserve">Parts 4–6: the left join and the accidental-key trap.</w:t>
+        <w:t xml:space="preserve">Parts 4–5: the left join.</w:t>
       </w:r>
     </w:p>
     <w:bookmarkEnd w:id="31"/>
@@ -2221,13 +2209,13 @@
       </w:r>
     </w:p>
     <w:bookmarkEnd w:id="32"/>
-    <w:bookmarkStart w:id="33" w:name="part-5-the-accidental-key-trap"/>
+    <w:bookmarkStart w:id="34" w:name="part-5-name-the-key-every-time"/>
     <w:p>
       <w:pPr>
         <w:pStyle w:val="Heading1"/>
       </w:pPr>
       <w:r>
-        <w:t xml:space="preserve">Part 5 · The accidental-key trap</w:t>
+        <w:t xml:space="preserve">Part 5 · Name the key every time</w:t>
       </w:r>
     </w:p>
     <w:p>
@@ -2235,7 +2223,93 @@
         <w:pStyle w:val="FirstParagraph"/>
       </w:pPr>
       <w:r>
-        <w:t xml:space="preserve">Run the same join again, on purpose, with</w:t>
+        <w:t xml:space="preserve">Redo the Part 4 join and</w:t>
+      </w:r>
+      <w:r>
+        <w:t xml:space="preserve"> </w:t>
+      </w:r>
+      <w:r>
+        <w:rPr>
+          <w:rStyle w:val="VerbatimChar"/>
+        </w:rPr>
+        <w:t xml:space="preserve">select()</w:t>
+      </w:r>
+      <w:r>
+        <w:t xml:space="preserve"> </w:t>
+      </w:r>
+      <w:r>
+        <w:t xml:space="preserve">down to</w:t>
+      </w:r>
+      <w:r>
+        <w:t xml:space="preserve"> </w:t>
+      </w:r>
+      <w:r>
+        <w:rPr>
+          <w:rStyle w:val="VerbatimChar"/>
+        </w:rPr>
+        <w:t xml:space="preserve">capture_event</w:t>
+      </w:r>
+      <w:r>
+        <w:t xml:space="preserve">,</w:t>
+      </w:r>
+      <w:r>
+        <w:t xml:space="preserve"> </w:t>
+      </w:r>
+      <w:r>
+        <w:rPr>
+          <w:rStyle w:val="VerbatimChar"/>
+        </w:rPr>
+        <w:t xml:space="preserve">animal_id</w:t>
+      </w:r>
+      <w:r>
+        <w:t xml:space="preserve">,</w:t>
+      </w:r>
+      <w:r>
+        <w:t xml:space="preserve"> </w:t>
+      </w:r>
+      <w:r>
+        <w:rPr>
+          <w:rStyle w:val="VerbatimChar"/>
+        </w:rPr>
+        <w:t xml:space="preserve">capture_date</w:t>
+      </w:r>
+      <w:r>
+        <w:t xml:space="preserve">,</w:t>
+      </w:r>
+      <w:r>
+        <w:t xml:space="preserve"> </w:t>
+      </w:r>
+      <w:r>
+        <w:rPr>
+          <w:rStyle w:val="VerbatimChar"/>
+        </w:rPr>
+        <w:t xml:space="preserve">sex</w:t>
+      </w:r>
+      <w:r>
+        <w:t xml:space="preserve">, and</w:t>
+      </w:r>
+      <w:r>
+        <w:t xml:space="preserve"> </w:t>
+      </w:r>
+      <w:r>
+        <w:rPr>
+          <w:rStyle w:val="VerbatimChar"/>
+        </w:rPr>
+        <w:t xml:space="preserve">age_class</w:t>
+      </w:r>
+      <w:r>
+        <w:t xml:space="preserve"> </w:t>
+      </w:r>
+      <w:r>
+        <w:t xml:space="preserve">so you can read it.</w:t>
+      </w:r>
+    </w:p>
+    <w:p>
+      <w:pPr>
+        <w:pStyle w:val="BodyText"/>
+      </w:pPr>
+      <w:r>
+        <w:t xml:space="preserve">✏️</w:t>
       </w:r>
       <w:r>
         <w:t xml:space="preserve"> </w:t>
@@ -2245,160 +2319,40 @@
           <w:b/>
           <w:bCs/>
         </w:rPr>
-        <w:t xml:space="preserve">no</w:t>
-      </w:r>
-      <w:r>
-        <w:t xml:space="preserve"> </w:t>
-      </w:r>
-      <w:r>
-        <w:rPr>
-          <w:rStyle w:val="VerbatimChar"/>
-        </w:rPr>
-        <w:t xml:space="preserve">by =</w:t>
-      </w:r>
-      <w:r>
-        <w:t xml:space="preserve"> </w:t>
-      </w:r>
-      <w:r>
-        <w:t xml:space="preserve">argument at all. Watch the message dplyr prints.</w:t>
-      </w:r>
-    </w:p>
-    <w:p>
-      <w:pPr>
-        <w:pStyle w:val="BodyText"/>
-      </w:pPr>
-      <w:r>
-        <w:t xml:space="preserve">✏️</w:t>
-      </w:r>
-      <w:r>
-        <w:t xml:space="preserve"> </w:t>
-      </w:r>
-      <w:r>
-        <w:rPr>
-          <w:b/>
-          <w:bCs/>
-        </w:rPr>
         <w:t xml:space="preserve">Q7:</w:t>
       </w:r>
       <w:r>
         <w:t xml:space="preserve"> </w:t>
       </w:r>
       <w:r>
-        <w:t xml:space="preserve">What column did dplyr announce it was joining on? Why is joining on</w:t>
-      </w:r>
-      <w:r>
-        <w:t xml:space="preserve"> </w:t>
-      </w:r>
-      <w:r>
-        <w:rPr>
-          <w:rStyle w:val="VerbatimChar"/>
-        </w:rPr>
-        <w:t xml:space="preserve">site</w:t>
-      </w:r>
-      <w:r>
-        <w:t xml:space="preserve"> </w:t>
-      </w:r>
-      <w:r>
-        <w:t xml:space="preserve">completely wrong here — what does it match a capture event to?</w:t>
-      </w:r>
-    </w:p>
-    <w:p>
-      <w:pPr>
-        <w:pStyle w:val="BodyText"/>
-      </w:pPr>
-      <w:r>
-        <w:t xml:space="preserve">✏️</w:t>
-      </w:r>
-      <w:r>
-        <w:t xml:space="preserve"> </w:t>
-      </w:r>
-      <w:r>
-        <w:rPr>
-          <w:b/>
-          <w:bCs/>
-        </w:rPr>
-        <w:t xml:space="preserve">Q8:</w:t>
-      </w:r>
-      <w:r>
-        <w:t xml:space="preserve"> </w:t>
-      </w:r>
-      <w:r>
-        <w:t xml:space="preserve">Row count of this accidental join versus the correct join in Part 4. Where did all those extra rows come from?</w:t>
-      </w:r>
-    </w:p>
-    <w:p>
-      <w:pPr>
-        <w:pStyle w:val="BlockText"/>
-      </w:pPr>
-      <w:r>
-        <w:t xml:space="preserve">⚠️</w:t>
-      </w:r>
-      <w:r>
-        <w:t xml:space="preserve"> </w:t>
-      </w:r>
-      <w:r>
-        <w:rPr>
-          <w:b/>
-          <w:bCs/>
-        </w:rPr>
-        <w:t xml:space="preserve">Watch out!</w:t>
-      </w:r>
-      <w:r>
-        <w:t xml:space="preserve"> </w:t>
-      </w:r>
-      <w:r>
-        <w:t xml:space="preserve">This is the join bug that bites hardest, because</w:t>
-      </w:r>
-      <w:r>
-        <w:t xml:space="preserve"> </w:t>
-      </w:r>
-      <w:r>
-        <w:rPr>
-          <w:b/>
-          <w:bCs/>
-        </w:rPr>
-        <w:t xml:space="preserve">nothing throws an error</w:t>
-      </w:r>
-      <w:r>
-        <w:t xml:space="preserve">. When dplyr prints</w:t>
-      </w:r>
-      <w:r>
-        <w:t xml:space="preserve"> </w:t>
-      </w:r>
-      <w:r>
-        <w:rPr>
-          <w:i/>
-          <w:iCs/>
-        </w:rPr>
-        <w:t xml:space="preserve">“Joining with</w:t>
-      </w:r>
-      <w:r>
-        <w:rPr>
-          <w:i/>
-          <w:iCs/>
-        </w:rPr>
-        <w:t xml:space="preserve"> </w:t>
-      </w:r>
-      <w:r>
-        <w:rPr>
-          <w:rStyle w:val="VerbatimChar"/>
-          <w:i/>
-          <w:iCs/>
-        </w:rPr>
-        <w:t xml:space="preserve">by = join_by(site)</w:t>
-      </w:r>
-      <w:r>
-        <w:rPr>
-          <w:i/>
-          <w:iCs/>
-        </w:rPr>
-        <w:t xml:space="preserve">”</w:t>
-      </w:r>
-      <w:r>
-        <w:t xml:space="preserve"> </w:t>
-      </w:r>
-      <w:r>
-        <w:t xml:space="preserve">and you did not choose that column, treat it as a bug report, not a status update.</w:t>
+        <w:t xml:space="preserve">Do any of the first rows already show</w:t>
+      </w:r>
+      <w:r>
+        <w:t xml:space="preserve"> </w:t>
+      </w:r>
+      <w:r>
+        <w:rPr>
+          <w:rStyle w:val="VerbatimChar"/>
+        </w:rPr>
+        <w:t xml:space="preserve">NA</w:t>
+      </w:r>
+      <w:r>
+        <w:t xml:space="preserve"> </w:t>
+      </w:r>
+      <w:r>
+        <w:t xml:space="preserve">for</w:t>
+      </w:r>
+      <w:r>
+        <w:t xml:space="preserve"> </w:t>
+      </w:r>
+      <w:r>
+        <w:rPr>
+          <w:rStyle w:val="VerbatimChar"/>
+        </w:rPr>
+        <w:t xml:space="preserve">sex</w:t>
+      </w:r>
+      <w:r>
+        <w:t xml:space="preserve">? What does that mean about that particular capture event?</w:t>
       </w:r>
     </w:p>
     <w:p>
@@ -2408,108 +2362,50 @@
         </w:pict>
       </w:r>
     </w:p>
-    <w:bookmarkEnd w:id="33"/>
-    <w:bookmarkStart w:id="35" w:name="part-6-name-the-key-every-time"/>
+    <w:p>
+      <w:pPr>
+        <w:pStyle w:val="Heading2"/>
+      </w:pPr>
+      <w:bookmarkStart w:id="33" w:name="X4d4386b28a7332813c57e3e90820daacd869290"/>
+      <w:r>
+        <w:t xml:space="preserve">🧩 Chunk 3 — The join family</w:t>
+      </w:r>
+      <w:r>
+        <w:t xml:space="preserve"> </w:t>
+      </w:r>
+      <w:r>
+        <w:rPr>
+          <w:i/>
+          <w:iCs/>
+        </w:rPr>
+        <w:t xml:space="preserve">(after lecture Chunk 3)</w:t>
+      </w:r>
+      <w:bookmarkEnd w:id="33"/>
+    </w:p>
+    <w:p>
+      <w:pPr>
+        <w:pStyle w:val="BlockText"/>
+      </w:pPr>
+      <w:r>
+        <w:t xml:space="preserve">Parts 6–8: inner vs. left vs. full.</w:t>
+      </w:r>
+    </w:p>
+    <w:bookmarkEnd w:id="34"/>
+    <w:bookmarkStart w:id="35" w:name="part-6-run-all-three-joins"/>
     <w:p>
       <w:pPr>
         <w:pStyle w:val="Heading1"/>
       </w:pPr>
       <w:r>
-        <w:t xml:space="preserve">Part 6 · Name the key every time</w:t>
-      </w:r>
-    </w:p>
-    <w:p>
-      <w:pPr>
-        <w:pStyle w:val="FirstParagraph"/>
-      </w:pPr>
-      <w:r>
-        <w:t xml:space="preserve">Redo the correct join and</w:t>
-      </w:r>
-      <w:r>
-        <w:t xml:space="preserve"> </w:t>
-      </w:r>
-      <w:r>
-        <w:rPr>
-          <w:rStyle w:val="VerbatimChar"/>
-        </w:rPr>
-        <w:t xml:space="preserve">select()</w:t>
-      </w:r>
-      <w:r>
-        <w:t xml:space="preserve"> </w:t>
-      </w:r>
-      <w:r>
-        <w:t xml:space="preserve">down to</w:t>
-      </w:r>
-      <w:r>
-        <w:t xml:space="preserve"> </w:t>
-      </w:r>
-      <w:r>
-        <w:rPr>
-          <w:rStyle w:val="VerbatimChar"/>
-        </w:rPr>
-        <w:t xml:space="preserve">capture_event</w:t>
-      </w:r>
-      <w:r>
-        <w:t xml:space="preserve">,</w:t>
-      </w:r>
-      <w:r>
-        <w:t xml:space="preserve"> </w:t>
-      </w:r>
-      <w:r>
-        <w:rPr>
-          <w:rStyle w:val="VerbatimChar"/>
-        </w:rPr>
-        <w:t xml:space="preserve">animal_id</w:t>
-      </w:r>
-      <w:r>
-        <w:t xml:space="preserve">,</w:t>
-      </w:r>
-      <w:r>
-        <w:t xml:space="preserve"> </w:t>
-      </w:r>
-      <w:r>
-        <w:rPr>
-          <w:rStyle w:val="VerbatimChar"/>
-        </w:rPr>
-        <w:t xml:space="preserve">capture_date</w:t>
-      </w:r>
-      <w:r>
-        <w:t xml:space="preserve">,</w:t>
-      </w:r>
-      <w:r>
-        <w:t xml:space="preserve"> </w:t>
-      </w:r>
-      <w:r>
-        <w:rPr>
-          <w:rStyle w:val="VerbatimChar"/>
-        </w:rPr>
-        <w:t xml:space="preserve">sex</w:t>
-      </w:r>
-      <w:r>
-        <w:t xml:space="preserve">, and</w:t>
-      </w:r>
-      <w:r>
-        <w:t xml:space="preserve"> </w:t>
-      </w:r>
-      <w:r>
-        <w:rPr>
-          <w:rStyle w:val="VerbatimChar"/>
-        </w:rPr>
-        <w:t xml:space="preserve">age_class</w:t>
-      </w:r>
-      <w:r>
-        <w:t xml:space="preserve"> </w:t>
-      </w:r>
-      <w:r>
-        <w:t xml:space="preserve">so you can read it.</w:t>
-      </w:r>
-    </w:p>
-    <w:p>
-      <w:pPr>
-        <w:pStyle w:val="BodyText"/>
-      </w:pPr>
-      <w:r>
-        <w:t xml:space="preserve">✏️</w:t>
+        <w:t xml:space="preserve">Part 6 · Run all three joins</w:t>
+      </w:r>
+    </w:p>
+    <w:p>
+      <w:pPr>
+        <w:pStyle w:val="BlockText"/>
+      </w:pPr>
+      <w:r>
+        <w:t xml:space="preserve">🔮</w:t>
       </w:r>
       <w:r>
         <w:t xml:space="preserve"> </w:t>
@@ -2519,40 +2415,139 @@
           <w:b/>
           <w:bCs/>
         </w:rPr>
-        <w:t xml:space="preserve">Q9:</w:t>
-      </w:r>
-      <w:r>
-        <w:t xml:space="preserve"> </w:t>
-      </w:r>
-      <w:r>
-        <w:t xml:space="preserve">Do any of the first rows already show</w:t>
-      </w:r>
-      <w:r>
-        <w:t xml:space="preserve"> </w:t>
-      </w:r>
-      <w:r>
-        <w:rPr>
-          <w:rStyle w:val="VerbatimChar"/>
-        </w:rPr>
-        <w:t xml:space="preserve">NA</w:t>
-      </w:r>
-      <w:r>
-        <w:t xml:space="preserve"> </w:t>
-      </w:r>
-      <w:r>
-        <w:t xml:space="preserve">for</w:t>
-      </w:r>
-      <w:r>
-        <w:t xml:space="preserve"> </w:t>
-      </w:r>
-      <w:r>
-        <w:rPr>
-          <w:rStyle w:val="VerbatimChar"/>
-        </w:rPr>
-        <w:t xml:space="preserve">sex</w:t>
-      </w:r>
-      <w:r>
-        <w:t xml:space="preserve">? What does that mean about that particular capture event?</w:t>
+        <w:t xml:space="preserve">Predict first:</w:t>
+      </w:r>
+      <w:r>
+        <w:t xml:space="preserve"> </w:t>
+      </w:r>
+      <w:r>
+        <w:t xml:space="preserve">rank these three by row count, most to fewest:</w:t>
+      </w:r>
+      <w:r>
+        <w:t xml:space="preserve"> </w:t>
+      </w:r>
+      <w:r>
+        <w:rPr>
+          <w:rStyle w:val="VerbatimChar"/>
+        </w:rPr>
+        <w:t xml:space="preserve">inner_join</w:t>
+      </w:r>
+      <w:r>
+        <w:t xml:space="preserve">,</w:t>
+      </w:r>
+      <w:r>
+        <w:t xml:space="preserve"> </w:t>
+      </w:r>
+      <w:r>
+        <w:rPr>
+          <w:rStyle w:val="VerbatimChar"/>
+        </w:rPr>
+        <w:t xml:space="preserve">left_join</w:t>
+      </w:r>
+      <w:r>
+        <w:t xml:space="preserve">,</w:t>
+      </w:r>
+      <w:r>
+        <w:t xml:space="preserve"> </w:t>
+      </w:r>
+      <w:r>
+        <w:rPr>
+          <w:rStyle w:val="VerbatimChar"/>
+        </w:rPr>
+        <w:t xml:space="preserve">full_join</w:t>
+      </w:r>
+      <w:r>
+        <w:t xml:space="preserve">.</w:t>
+      </w:r>
+    </w:p>
+    <w:p>
+      <w:pPr>
+        <w:pStyle w:val="FirstParagraph"/>
+      </w:pPr>
+      <w:r>
+        <w:t xml:space="preserve">Store the key once in a variable, then run all three joins and report the three row counts side by side with</w:t>
+      </w:r>
+      <w:r>
+        <w:t xml:space="preserve"> </w:t>
+      </w:r>
+      <w:r>
+        <w:rPr>
+          <w:rStyle w:val="VerbatimChar"/>
+        </w:rPr>
+        <w:t xml:space="preserve">c()</w:t>
+      </w:r>
+      <w:r>
+        <w:t xml:space="preserve">.</w:t>
+      </w:r>
+    </w:p>
+    <w:p>
+      <w:pPr>
+        <w:pStyle w:val="BodyText"/>
+      </w:pPr>
+      <w:r>
+        <w:t xml:space="preserve">✏️</w:t>
+      </w:r>
+      <w:r>
+        <w:t xml:space="preserve"> </w:t>
+      </w:r>
+      <w:r>
+        <w:rPr>
+          <w:b/>
+          <w:bCs/>
+        </w:rPr>
+        <w:t xml:space="preserve">Q8:</w:t>
+      </w:r>
+      <w:r>
+        <w:t xml:space="preserve"> </w:t>
+      </w:r>
+      <w:r>
+        <w:t xml:space="preserve">The three row counts. Was your ranking right? Why does</w:t>
+      </w:r>
+      <w:r>
+        <w:t xml:space="preserve"> </w:t>
+      </w:r>
+      <w:r>
+        <w:rPr>
+          <w:rStyle w:val="VerbatimChar"/>
+        </w:rPr>
+        <w:t xml:space="preserve">full</w:t>
+      </w:r>
+      <w:r>
+        <w:t xml:space="preserve"> </w:t>
+      </w:r>
+      <w:r>
+        <w:t xml:space="preserve">have</w:t>
+      </w:r>
+      <w:r>
+        <w:t xml:space="preserve"> </w:t>
+      </w:r>
+      <w:r>
+        <w:rPr>
+          <w:b/>
+          <w:bCs/>
+        </w:rPr>
+        <w:t xml:space="preserve">more</w:t>
+      </w:r>
+      <w:r>
+        <w:t xml:space="preserve"> </w:t>
+      </w:r>
+      <w:r>
+        <w:t xml:space="preserve">rows than</w:t>
+      </w:r>
+      <w:r>
+        <w:t xml:space="preserve"> </w:t>
+      </w:r>
+      <w:r>
+        <w:rPr>
+          <w:rStyle w:val="VerbatimChar"/>
+        </w:rPr>
+        <w:t xml:space="preserve">left</w:t>
+      </w:r>
+      <w:r>
+        <w:t xml:space="preserve"> </w:t>
+      </w:r>
+      <w:r>
+        <w:t xml:space="preserve">— which fishers does it add back?</w:t>
       </w:r>
     </w:p>
     <w:p>
@@ -2562,50 +2557,22 @@
         </w:pict>
       </w:r>
     </w:p>
-    <w:p>
-      <w:pPr>
-        <w:pStyle w:val="Heading2"/>
-      </w:pPr>
-      <w:bookmarkStart w:id="34" w:name="X4d4386b28a7332813c57e3e90820daacd869290"/>
-      <w:r>
-        <w:t xml:space="preserve">🧩 Chunk 3 — The join family</w:t>
-      </w:r>
-      <w:r>
-        <w:t xml:space="preserve"> </w:t>
-      </w:r>
-      <w:r>
-        <w:rPr>
-          <w:i/>
-          <w:iCs/>
-        </w:rPr>
-        <w:t xml:space="preserve">(after lecture Chunk 3)</w:t>
-      </w:r>
-      <w:bookmarkEnd w:id="34"/>
-    </w:p>
-    <w:p>
-      <w:pPr>
-        <w:pStyle w:val="BlockText"/>
-      </w:pPr>
-      <w:r>
-        <w:t xml:space="preserve">Parts 7–9: inner vs. left vs. full.</w:t>
-      </w:r>
-    </w:p>
     <w:bookmarkEnd w:id="35"/>
-    <w:bookmarkStart w:id="36" w:name="part-7-run-all-three-joins"/>
+    <w:bookmarkStart w:id="36" w:name="part-7-what-each-join-dropped-or-kept"/>
     <w:p>
       <w:pPr>
         <w:pStyle w:val="Heading1"/>
       </w:pPr>
       <w:r>
-        <w:t xml:space="preserve">Part 7 · Run all three joins</w:t>
-      </w:r>
-    </w:p>
-    <w:p>
-      <w:pPr>
-        <w:pStyle w:val="BlockText"/>
-      </w:pPr>
-      <w:r>
-        <w:t xml:space="preserve">🔮</w:t>
+        <w:t xml:space="preserve">Part 7 · What each join dropped or kept</w:t>
+      </w:r>
+    </w:p>
+    <w:p>
+      <w:pPr>
+        <w:pStyle w:val="FirstParagraph"/>
+      </w:pPr>
+      <w:r>
+        <w:t xml:space="preserve">✏️</w:t>
       </w:r>
       <w:r>
         <w:t xml:space="preserve"> </w:t>
@@ -2615,13 +2582,13 @@
           <w:b/>
           <w:bCs/>
         </w:rPr>
-        <w:t xml:space="preserve">Predict first:</w:t>
-      </w:r>
-      <w:r>
-        <w:t xml:space="preserve"> </w:t>
-      </w:r>
-      <w:r>
-        <w:t xml:space="preserve">rank these three by row count, most to fewest:</w:t>
+        <w:t xml:space="preserve">Q9:</w:t>
+      </w:r>
+      <w:r>
+        <w:t xml:space="preserve"> </w:t>
+      </w:r>
+      <w:r>
+        <w:t xml:space="preserve">In your own words, what does each of</w:t>
       </w:r>
       <w:r>
         <w:t xml:space="preserve"> </w:t>
@@ -2645,7 +2612,7 @@
         <w:t xml:space="preserve">left_join</w:t>
       </w:r>
       <w:r>
-        <w:t xml:space="preserve">,</w:t>
+        <w:t xml:space="preserve">, and</w:t>
       </w:r>
       <w:r>
         <w:t xml:space="preserve"> </w:t>
@@ -2657,27 +2624,10 @@
         <w:t xml:space="preserve">full_join</w:t>
       </w:r>
       <w:r>
-        <w:t xml:space="preserve">.</w:t>
-      </w:r>
-    </w:p>
-    <w:p>
-      <w:pPr>
-        <w:pStyle w:val="FirstParagraph"/>
-      </w:pPr>
-      <w:r>
-        <w:t xml:space="preserve">Store the key once in a variable, then run all three joins and report the three row counts side by side with</w:t>
-      </w:r>
-      <w:r>
-        <w:t xml:space="preserve"> </w:t>
-      </w:r>
-      <w:r>
-        <w:rPr>
-          <w:rStyle w:val="VerbatimChar"/>
-        </w:rPr>
-        <w:t xml:space="preserve">c()</w:t>
-      </w:r>
-      <w:r>
-        <w:t xml:space="preserve">.</w:t>
+        <w:t xml:space="preserve"> </w:t>
+      </w:r>
+      <w:r>
+        <w:t xml:space="preserve">keep?</w:t>
       </w:r>
     </w:p>
     <w:p>
@@ -2701,22 +2651,16 @@
         <w:t xml:space="preserve"> </w:t>
       </w:r>
       <w:r>
-        <w:t xml:space="preserve">The three row counts. Was your ranking right? Why does</w:t>
-      </w:r>
-      <w:r>
-        <w:t xml:space="preserve"> </w:t>
-      </w:r>
-      <w:r>
-        <w:rPr>
-          <w:rStyle w:val="VerbatimChar"/>
-        </w:rPr>
-        <w:t xml:space="preserve">full</w:t>
-      </w:r>
-      <w:r>
-        <w:t xml:space="preserve"> </w:t>
-      </w:r>
-      <w:r>
-        <w:t xml:space="preserve">have</w:t>
+        <w:t xml:space="preserve">Which capture events does</w:t>
+      </w:r>
+      <w:r>
+        <w:t xml:space="preserve"> </w:t>
+      </w:r>
+      <w:r>
+        <w:rPr>
+          <w:rStyle w:val="VerbatimChar"/>
+        </w:rPr>
+        <w:t xml:space="preserve">inner_join</w:t>
       </w:r>
       <w:r>
         <w:t xml:space="preserve"> </w:t>
@@ -2726,28 +2670,53 @@
           <w:b/>
           <w:bCs/>
         </w:rPr>
-        <w:t xml:space="preserve">more</w:t>
-      </w:r>
-      <w:r>
-        <w:t xml:space="preserve"> </w:t>
-      </w:r>
-      <w:r>
-        <w:t xml:space="preserve">rows than</w:t>
-      </w:r>
-      <w:r>
-        <w:t xml:space="preserve"> </w:t>
-      </w:r>
-      <w:r>
-        <w:rPr>
-          <w:rStyle w:val="VerbatimChar"/>
-        </w:rPr>
-        <w:t xml:space="preserve">left</w:t>
-      </w:r>
-      <w:r>
-        <w:t xml:space="preserve"> </w:t>
-      </w:r>
-      <w:r>
-        <w:t xml:space="preserve">— which fishers does it add back?</w:t>
+        <w:t xml:space="preserve">drop</w:t>
+      </w:r>
+      <w:r>
+        <w:t xml:space="preserve"> </w:t>
+      </w:r>
+      <w:r>
+        <w:t xml:space="preserve">that</w:t>
+      </w:r>
+      <w:r>
+        <w:t xml:space="preserve"> </w:t>
+      </w:r>
+      <w:r>
+        <w:rPr>
+          <w:rStyle w:val="VerbatimChar"/>
+        </w:rPr>
+        <w:t xml:space="preserve">left_join</w:t>
+      </w:r>
+      <w:r>
+        <w:t xml:space="preserve"> </w:t>
+      </w:r>
+      <w:r>
+        <w:t xml:space="preserve">keeps? Which fishers does</w:t>
+      </w:r>
+      <w:r>
+        <w:t xml:space="preserve"> </w:t>
+      </w:r>
+      <w:r>
+        <w:rPr>
+          <w:rStyle w:val="VerbatimChar"/>
+        </w:rPr>
+        <w:t xml:space="preserve">full_join</w:t>
+      </w:r>
+      <w:r>
+        <w:t xml:space="preserve"> </w:t>
+      </w:r>
+      <w:r>
+        <w:rPr>
+          <w:b/>
+          <w:bCs/>
+        </w:rPr>
+        <w:t xml:space="preserve">add</w:t>
+      </w:r>
+      <w:r>
+        <w:t xml:space="preserve"> </w:t>
+      </w:r>
+      <w:r>
+        <w:t xml:space="preserve">that neither of the others includes?</w:t>
       </w:r>
     </w:p>
     <w:p>
@@ -2758,13 +2727,13 @@
       </w:r>
     </w:p>
     <w:bookmarkEnd w:id="36"/>
-    <w:bookmarkStart w:id="37" w:name="part-8-what-each-join-dropped-or-kept"/>
+    <w:bookmarkStart w:id="38" w:name="part-8-pick-the-right-join"/>
     <w:p>
       <w:pPr>
         <w:pStyle w:val="Heading1"/>
       </w:pPr>
       <w:r>
-        <w:t xml:space="preserve">Part 8 · What each join dropped or kept</w:t>
+        <w:t xml:space="preserve">Part 8 · Pick the right join</w:t>
       </w:r>
     </w:p>
     <w:p>
@@ -2788,54 +2757,7 @@
         <w:t xml:space="preserve"> </w:t>
       </w:r>
       <w:r>
-        <w:t xml:space="preserve">In your own words, what does each of</w:t>
-      </w:r>
-      <w:r>
-        <w:t xml:space="preserve"> </w:t>
-      </w:r>
-      <w:r>
-        <w:rPr>
-          <w:rStyle w:val="VerbatimChar"/>
-        </w:rPr>
-        <w:t xml:space="preserve">inner_join</w:t>
-      </w:r>
-      <w:r>
-        <w:t xml:space="preserve">,</w:t>
-      </w:r>
-      <w:r>
-        <w:t xml:space="preserve"> </w:t>
-      </w:r>
-      <w:r>
-        <w:rPr>
-          <w:rStyle w:val="VerbatimChar"/>
-        </w:rPr>
-        <w:t xml:space="preserve">left_join</w:t>
-      </w:r>
-      <w:r>
-        <w:t xml:space="preserve">, and</w:t>
-      </w:r>
-      <w:r>
-        <w:t xml:space="preserve"> </w:t>
-      </w:r>
-      <w:r>
-        <w:rPr>
-          <w:rStyle w:val="VerbatimChar"/>
-        </w:rPr>
-        <w:t xml:space="preserve">full_join</w:t>
-      </w:r>
-      <w:r>
-        <w:t xml:space="preserve"> </w:t>
-      </w:r>
-      <w:r>
-        <w:t xml:space="preserve">keep?</w:t>
-      </w:r>
-    </w:p>
-    <w:p>
-      <w:pPr>
-        <w:pStyle w:val="BodyText"/>
-      </w:pPr>
-      <w:r>
-        <w:t xml:space="preserve">✏️</w:t>
+        <w:t xml:space="preserve">You want a table of</w:t>
       </w:r>
       <w:r>
         <w:t xml:space="preserve"> </w:t>
@@ -2845,22 +2767,21 @@
           <w:b/>
           <w:bCs/>
         </w:rPr>
-        <w:t xml:space="preserve">Q12:</w:t>
-      </w:r>
-      <w:r>
-        <w:t xml:space="preserve"> </w:t>
-      </w:r>
-      <w:r>
-        <w:t xml:space="preserve">Which capture events does</w:t>
-      </w:r>
-      <w:r>
-        <w:t xml:space="preserve"> </w:t>
-      </w:r>
-      <w:r>
-        <w:rPr>
-          <w:rStyle w:val="VerbatimChar"/>
-        </w:rPr>
-        <w:t xml:space="preserve">inner_join</w:t>
+        <w:t xml:space="preserve">every capture event</w:t>
+      </w:r>
+      <w:r>
+        <w:t xml:space="preserve"> </w:t>
+      </w:r>
+      <w:r>
+        <w:t xml:space="preserve">for a survival analysis, keeping the event even when the animal was unmarked. Which join, and why?</w:t>
+      </w:r>
+    </w:p>
+    <w:p>
+      <w:pPr>
+        <w:pStyle w:val="BlockText"/>
+      </w:pPr>
+      <w:r>
+        <w:t xml:space="preserve">💡</w:t>
       </w:r>
       <w:r>
         <w:t xml:space="preserve"> </w:t>
@@ -2870,37 +2791,13 @@
           <w:b/>
           <w:bCs/>
         </w:rPr>
-        <w:t xml:space="preserve">drop</w:t>
-      </w:r>
-      <w:r>
-        <w:t xml:space="preserve"> </w:t>
-      </w:r>
-      <w:r>
-        <w:t xml:space="preserve">that</w:t>
-      </w:r>
-      <w:r>
-        <w:t xml:space="preserve"> </w:t>
-      </w:r>
-      <w:r>
-        <w:rPr>
-          <w:rStyle w:val="VerbatimChar"/>
-        </w:rPr>
-        <w:t xml:space="preserve">left_join</w:t>
-      </w:r>
-      <w:r>
-        <w:t xml:space="preserve"> </w:t>
-      </w:r>
-      <w:r>
-        <w:t xml:space="preserve">keeps? Which fishers does</w:t>
-      </w:r>
-      <w:r>
-        <w:t xml:space="preserve"> </w:t>
-      </w:r>
-      <w:r>
-        <w:rPr>
-          <w:rStyle w:val="VerbatimChar"/>
-        </w:rPr>
-        <w:t xml:space="preserve">full_join</w:t>
+        <w:t xml:space="preserve">Key idea:</w:t>
+      </w:r>
+      <w:r>
+        <w:t xml:space="preserve"> </w:t>
+      </w:r>
+      <w:r>
+        <w:t xml:space="preserve">decide which rows you cannot afford to lose</w:t>
       </w:r>
       <w:r>
         <w:t xml:space="preserve"> </w:t>
@@ -2910,13 +2807,37 @@
           <w:b/>
           <w:bCs/>
         </w:rPr>
-        <w:t xml:space="preserve">add</w:t>
-      </w:r>
-      <w:r>
-        <w:t xml:space="preserve"> </w:t>
-      </w:r>
-      <w:r>
-        <w:t xml:space="preserve">that neither of the others includes?</w:t>
+        <w:t xml:space="preserve">first</w:t>
+      </w:r>
+      <w:r>
+        <w:t xml:space="preserve">, then pick the join. An unmarked-animal capture is still a capture, so an event-level analysis calls for</w:t>
+      </w:r>
+      <w:r>
+        <w:t xml:space="preserve"> </w:t>
+      </w:r>
+      <w:r>
+        <w:rPr>
+          <w:rStyle w:val="VerbatimChar"/>
+        </w:rPr>
+        <w:t xml:space="preserve">left_join</w:t>
+      </w:r>
+      <w:r>
+        <w:t xml:space="preserve"> </w:t>
+      </w:r>
+      <w:r>
+        <w:t xml:space="preserve">with captures on the left — not</w:t>
+      </w:r>
+      <w:r>
+        <w:t xml:space="preserve"> </w:t>
+      </w:r>
+      <w:r>
+        <w:rPr>
+          <w:rStyle w:val="VerbatimChar"/>
+        </w:rPr>
+        <w:t xml:space="preserve">inner_join</w:t>
+      </w:r>
+      <w:r>
+        <w:t xml:space="preserve">.</w:t>
       </w:r>
     </w:p>
     <w:p>
@@ -2926,22 +2847,65 @@
         </w:pict>
       </w:r>
     </w:p>
-    <w:bookmarkEnd w:id="37"/>
-    <w:bookmarkStart w:id="39" w:name="part-9-pick-the-right-join"/>
+    <w:p>
+      <w:pPr>
+        <w:pStyle w:val="Heading2"/>
+      </w:pPr>
+      <w:bookmarkStart w:id="37" w:name="X821689818a38c61b0db55a5d429dd34716e33a2"/>
+      <w:r>
+        <w:t xml:space="preserve">🧩 Chunk 4 — Filtering joins &amp; the payoff</w:t>
+      </w:r>
+      <w:r>
+        <w:t xml:space="preserve"> </w:t>
+      </w:r>
+      <w:r>
+        <w:rPr>
+          <w:i/>
+          <w:iCs/>
+        </w:rPr>
+        <w:t xml:space="preserve">(after lecture Chunk 4)</w:t>
+      </w:r>
+      <w:bookmarkEnd w:id="37"/>
+    </w:p>
+    <w:p>
+      <w:pPr>
+        <w:pStyle w:val="BlockText"/>
+      </w:pPr>
+      <w:r>
+        <w:t xml:space="preserve">Parts 9–11: anti/semi joins and the analysis-ready table.</w:t>
+      </w:r>
+    </w:p>
+    <w:bookmarkEnd w:id="38"/>
+    <w:bookmarkStart w:id="39" w:name="part-9-anti_join-whats-missing"/>
     <w:p>
       <w:pPr>
         <w:pStyle w:val="Heading1"/>
       </w:pPr>
       <w:r>
-        <w:t xml:space="preserve">Part 9 · Pick the right join</w:t>
-      </w:r>
-    </w:p>
-    <w:p>
-      <w:pPr>
-        <w:pStyle w:val="FirstParagraph"/>
-      </w:pPr>
-      <w:r>
-        <w:t xml:space="preserve">✏️</w:t>
+        <w:t xml:space="preserve">Part 9 ·</w:t>
+      </w:r>
+      <w:r>
+        <w:t xml:space="preserve"> </w:t>
+      </w:r>
+      <w:r>
+        <w:rPr>
+          <w:rStyle w:val="VerbatimChar"/>
+        </w:rPr>
+        <w:t xml:space="preserve">anti_join()</w:t>
+      </w:r>
+      <w:r>
+        <w:t xml:space="preserve"> </w:t>
+      </w:r>
+      <w:r>
+        <w:t xml:space="preserve">— what’s missing</w:t>
+      </w:r>
+    </w:p>
+    <w:p>
+      <w:pPr>
+        <w:pStyle w:val="BlockText"/>
+      </w:pPr>
+      <w:r>
+        <w:t xml:space="preserve">🔮</w:t>
       </w:r>
       <w:r>
         <w:t xml:space="preserve"> </w:t>
@@ -2951,13 +2915,13 @@
           <w:b/>
           <w:bCs/>
         </w:rPr>
-        <w:t xml:space="preserve">Q13:</w:t>
-      </w:r>
-      <w:r>
-        <w:t xml:space="preserve"> </w:t>
-      </w:r>
-      <w:r>
-        <w:t xml:space="preserve">You want a table of</w:t>
+        <w:t xml:space="preserve">Predict first, two ways:</w:t>
+      </w:r>
+      <w:r>
+        <w:t xml:space="preserve"> </w:t>
+      </w:r>
+      <w:r>
+        <w:t xml:space="preserve">(a) how many</w:t>
       </w:r>
       <w:r>
         <w:t xml:space="preserve"> </w:t>
@@ -2967,21 +2931,19 @@
           <w:b/>
           <w:bCs/>
         </w:rPr>
-        <w:t xml:space="preserve">every capture event</w:t>
-      </w:r>
-      <w:r>
-        <w:t xml:space="preserve"> </w:t>
-      </w:r>
-      <w:r>
-        <w:t xml:space="preserve">for a survival analysis, keeping the event even when the animal was unmarked. Which join, and why?</w:t>
-      </w:r>
-    </w:p>
-    <w:p>
-      <w:pPr>
-        <w:pStyle w:val="BlockText"/>
-      </w:pPr>
-      <w:r>
-        <w:t xml:space="preserve">💡</w:t>
+        <w:t xml:space="preserve">capture events</w:t>
+      </w:r>
+      <w:r>
+        <w:t xml:space="preserve"> </w:t>
+      </w:r>
+      <w:r>
+        <w:t xml:space="preserve">have no matching individual?</w:t>
+      </w:r>
+      <w:r>
+        <w:t xml:space="preserve"> </w:t>
+      </w:r>
+      <w:r>
+        <w:t xml:space="preserve">(b) how many</w:t>
       </w:r>
       <w:r>
         <w:t xml:space="preserve"> </w:t>
@@ -2991,13 +2953,33 @@
           <w:b/>
           <w:bCs/>
         </w:rPr>
-        <w:t xml:space="preserve">Key idea:</w:t>
-      </w:r>
-      <w:r>
-        <w:t xml:space="preserve"> </w:t>
-      </w:r>
-      <w:r>
-        <w:t xml:space="preserve">decide which rows you cannot afford to lose</w:t>
+        <w:t xml:space="preserve">released fishers</w:t>
+      </w:r>
+      <w:r>
+        <w:t xml:space="preserve"> </w:t>
+      </w:r>
+      <w:r>
+        <w:t xml:space="preserve">were never recaptured?</w:t>
+      </w:r>
+    </w:p>
+    <w:p>
+      <w:pPr>
+        <w:pStyle w:val="FirstParagraph"/>
+      </w:pPr>
+      <w:r>
+        <w:t xml:space="preserve">Write both</w:t>
+      </w:r>
+      <w:r>
+        <w:t xml:space="preserve"> </w:t>
+      </w:r>
+      <w:r>
+        <w:rPr>
+          <w:rStyle w:val="VerbatimChar"/>
+        </w:rPr>
+        <w:t xml:space="preserve">anti_join()</w:t>
+      </w:r>
+      <w:r>
+        <w:t xml:space="preserve">s. Note that (b) runs in the</w:t>
       </w:r>
       <w:r>
         <w:t xml:space="preserve"> </w:t>
@@ -3007,37 +2989,101 @@
           <w:b/>
           <w:bCs/>
         </w:rPr>
-        <w:t xml:space="preserve">first</w:t>
-      </w:r>
-      <w:r>
-        <w:t xml:space="preserve">, then pick the join. An unmarked-animal capture is still a capture, so an event-level analysis calls for</w:t>
-      </w:r>
-      <w:r>
-        <w:t xml:space="preserve"> </w:t>
-      </w:r>
-      <w:r>
-        <w:rPr>
-          <w:rStyle w:val="VerbatimChar"/>
-        </w:rPr>
-        <w:t xml:space="preserve">left_join</w:t>
-      </w:r>
-      <w:r>
-        <w:t xml:space="preserve"> </w:t>
-      </w:r>
-      <w:r>
-        <w:t xml:space="preserve">with captures on the left — not</w:t>
-      </w:r>
-      <w:r>
-        <w:t xml:space="preserve"> </w:t>
-      </w:r>
-      <w:r>
-        <w:rPr>
-          <w:rStyle w:val="VerbatimChar"/>
-        </w:rPr>
-        <w:t xml:space="preserve">inner_join</w:t>
-      </w:r>
-      <w:r>
-        <w:t xml:space="preserve">.</w:t>
+        <w:t xml:space="preserve">other direction</w:t>
+      </w:r>
+      <w:r>
+        <w:t xml:space="preserve"> </w:t>
+      </w:r>
+      <w:r>
+        <w:t xml:space="preserve">— individuals on the left — and that the</w:t>
+      </w:r>
+      <w:r>
+        <w:t xml:space="preserve"> </w:t>
+      </w:r>
+      <w:r>
+        <w:rPr>
+          <w:rStyle w:val="VerbatimChar"/>
+        </w:rPr>
+        <w:t xml:space="preserve">by =</w:t>
+      </w:r>
+      <w:r>
+        <w:t xml:space="preserve"> </w:t>
+      </w:r>
+      <w:r>
+        <w:t xml:space="preserve">flips with it.</w:t>
+      </w:r>
+    </w:p>
+    <w:p>
+      <w:pPr>
+        <w:pStyle w:val="BodyText"/>
+      </w:pPr>
+      <w:r>
+        <w:t xml:space="preserve">✏️</w:t>
+      </w:r>
+      <w:r>
+        <w:t xml:space="preserve"> </w:t>
+      </w:r>
+      <w:r>
+        <w:rPr>
+          <w:b/>
+          <w:bCs/>
+        </w:rPr>
+        <w:t xml:space="preserve">Q12:</w:t>
+      </w:r>
+      <w:r>
+        <w:t xml:space="preserve"> </w:t>
+      </w:r>
+      <w:r>
+        <w:t xml:space="preserve">Capture events with no individual, and released fishers never recaptured. Were your predictions close?</w:t>
+      </w:r>
+    </w:p>
+    <w:p>
+      <w:pPr>
+        <w:pStyle w:val="BodyText"/>
+      </w:pPr>
+      <w:r>
+        <w:t xml:space="preserve">✏️</w:t>
+      </w:r>
+      <w:r>
+        <w:t xml:space="preserve"> </w:t>
+      </w:r>
+      <w:r>
+        <w:rPr>
+          <w:b/>
+          <w:bCs/>
+        </w:rPr>
+        <w:t xml:space="preserve">Q13:</w:t>
+      </w:r>
+      <w:r>
+        <w:t xml:space="preserve"> </w:t>
+      </w:r>
+      <w:r>
+        <w:t xml:space="preserve">Did</w:t>
+      </w:r>
+      <w:r>
+        <w:t xml:space="preserve"> </w:t>
+      </w:r>
+      <w:r>
+        <w:rPr>
+          <w:rStyle w:val="VerbatimChar"/>
+        </w:rPr>
+        <w:t xml:space="preserve">anti_join()</w:t>
+      </w:r>
+      <w:r>
+        <w:t xml:space="preserve"> </w:t>
+      </w:r>
+      <w:r>
+        <w:rPr>
+          <w:b/>
+          <w:bCs/>
+        </w:rPr>
+        <w:t xml:space="preserve">add</w:t>
+      </w:r>
+      <w:r>
+        <w:t xml:space="preserve"> </w:t>
+      </w:r>
+      <w:r>
+        <w:t xml:space="preserve">any columns, or only filter rows? Check the column names against the table you started from.</w:t>
       </w:r>
     </w:p>
     <w:p>
@@ -3047,36 +3093,8 @@
         </w:pict>
       </w:r>
     </w:p>
-    <w:p>
-      <w:pPr>
-        <w:pStyle w:val="Heading2"/>
-      </w:pPr>
-      <w:bookmarkStart w:id="38" w:name="X821689818a38c61b0db55a5d429dd34716e33a2"/>
-      <w:r>
-        <w:t xml:space="preserve">🧩 Chunk 4 — Filtering joins &amp; the payoff</w:t>
-      </w:r>
-      <w:r>
-        <w:t xml:space="preserve"> </w:t>
-      </w:r>
-      <w:r>
-        <w:rPr>
-          <w:i/>
-          <w:iCs/>
-        </w:rPr>
-        <w:t xml:space="preserve">(after lecture Chunk 4)</w:t>
-      </w:r>
-      <w:bookmarkEnd w:id="38"/>
-    </w:p>
-    <w:p>
-      <w:pPr>
-        <w:pStyle w:val="BlockText"/>
-      </w:pPr>
-      <w:r>
-        <w:t xml:space="preserve">Parts 10–12: anti/semi joins and the analysis-ready table.</w:t>
-      </w:r>
-    </w:p>
     <w:bookmarkEnd w:id="39"/>
-    <w:bookmarkStart w:id="40" w:name="part-10-anti_join-whats-missing"/>
+    <w:bookmarkStart w:id="40" w:name="part-10-semi_join-keep-only-matches"/>
     <w:p>
       <w:pPr>
         <w:pStyle w:val="Heading1"/>
@@ -3091,21 +3109,36 @@
         <w:rPr>
           <w:rStyle w:val="VerbatimChar"/>
         </w:rPr>
-        <w:t xml:space="preserve">anti_join()</w:t>
-      </w:r>
-      <w:r>
-        <w:t xml:space="preserve"> </w:t>
-      </w:r>
-      <w:r>
-        <w:t xml:space="preserve">— what’s missing</w:t>
-      </w:r>
-    </w:p>
-    <w:p>
-      <w:pPr>
-        <w:pStyle w:val="BlockText"/>
-      </w:pPr>
-      <w:r>
-        <w:t xml:space="preserve">🔮</w:t>
+        <w:t xml:space="preserve">semi_join()</w:t>
+      </w:r>
+      <w:r>
+        <w:t xml:space="preserve"> </w:t>
+      </w:r>
+      <w:r>
+        <w:t xml:space="preserve">— keep only matches</w:t>
+      </w:r>
+    </w:p>
+    <w:p>
+      <w:pPr>
+        <w:pStyle w:val="FirstParagraph"/>
+      </w:pPr>
+      <w:r>
+        <w:t xml:space="preserve">Write the</w:t>
+      </w:r>
+      <w:r>
+        <w:t xml:space="preserve"> </w:t>
+      </w:r>
+      <w:r>
+        <w:rPr>
+          <w:rStyle w:val="VerbatimChar"/>
+        </w:rPr>
+        <w:t xml:space="preserve">semi_join()</w:t>
+      </w:r>
+      <w:r>
+        <w:t xml:space="preserve"> </w:t>
+      </w:r>
+      <w:r>
+        <w:t xml:space="preserve">that keeps the released fishers that</w:t>
       </w:r>
       <w:r>
         <w:t xml:space="preserve"> </w:t>
@@ -3115,13 +3148,21 @@
           <w:b/>
           <w:bCs/>
         </w:rPr>
-        <w:t xml:space="preserve">Predict first, two ways:</w:t>
-      </w:r>
-      <w:r>
-        <w:t xml:space="preserve"> </w:t>
-      </w:r>
-      <w:r>
-        <w:t xml:space="preserve">(a) how many</w:t>
+        <w:t xml:space="preserve">were</w:t>
+      </w:r>
+      <w:r>
+        <w:t xml:space="preserve"> </w:t>
+      </w:r>
+      <w:r>
+        <w:t xml:space="preserve">recaptured at least once, and count them.</w:t>
+      </w:r>
+    </w:p>
+    <w:p>
+      <w:pPr>
+        <w:pStyle w:val="BodyText"/>
+      </w:pPr>
+      <w:r>
+        <w:t xml:space="preserve">✏️</w:t>
       </w:r>
       <w:r>
         <w:t xml:space="preserve"> </w:t>
@@ -3131,19 +3172,40 @@
           <w:b/>
           <w:bCs/>
         </w:rPr>
-        <w:t xml:space="preserve">capture events</w:t>
-      </w:r>
-      <w:r>
-        <w:t xml:space="preserve"> </w:t>
-      </w:r>
-      <w:r>
-        <w:t xml:space="preserve">have no matching individual?</w:t>
-      </w:r>
-      <w:r>
-        <w:t xml:space="preserve"> </w:t>
-      </w:r>
-      <w:r>
-        <w:t xml:space="preserve">(b) how many</w:t>
+        <w:t xml:space="preserve">Q14:</w:t>
+      </w:r>
+      <w:r>
+        <w:t xml:space="preserve"> </w:t>
+      </w:r>
+      <w:r>
+        <w:t xml:space="preserve">How is</w:t>
+      </w:r>
+      <w:r>
+        <w:t xml:space="preserve"> </w:t>
+      </w:r>
+      <w:r>
+        <w:rPr>
+          <w:rStyle w:val="VerbatimChar"/>
+        </w:rPr>
+        <w:t xml:space="preserve">semi_join()</w:t>
+      </w:r>
+      <w:r>
+        <w:t xml:space="preserve"> </w:t>
+      </w:r>
+      <w:r>
+        <w:t xml:space="preserve">different from</w:t>
+      </w:r>
+      <w:r>
+        <w:t xml:space="preserve"> </w:t>
+      </w:r>
+      <w:r>
+        <w:rPr>
+          <w:rStyle w:val="VerbatimChar"/>
+        </w:rPr>
+        <w:t xml:space="preserve">inner_join()</w:t>
+      </w:r>
+      <w:r>
+        <w:t xml:space="preserve">? Look at the</w:t>
       </w:r>
       <w:r>
         <w:t xml:space="preserve"> </w:t>
@@ -3153,33 +3215,18 @@
           <w:b/>
           <w:bCs/>
         </w:rPr>
-        <w:t xml:space="preserve">released fishers</w:t>
-      </w:r>
-      <w:r>
-        <w:t xml:space="preserve"> </w:t>
-      </w:r>
-      <w:r>
-        <w:t xml:space="preserve">were never recaptured?</w:t>
-      </w:r>
-    </w:p>
-    <w:p>
-      <w:pPr>
-        <w:pStyle w:val="FirstParagraph"/>
-      </w:pPr>
-      <w:r>
-        <w:t xml:space="preserve">Write both</w:t>
-      </w:r>
-      <w:r>
-        <w:t xml:space="preserve"> </w:t>
-      </w:r>
-      <w:r>
-        <w:rPr>
-          <w:rStyle w:val="VerbatimChar"/>
-        </w:rPr>
-        <w:t xml:space="preserve">anti_join()</w:t>
-      </w:r>
-      <w:r>
-        <w:t xml:space="preserve">s. Note that (b) runs in the</w:t>
+        <w:t xml:space="preserve">columns</w:t>
+      </w:r>
+      <w:r>
+        <w:t xml:space="preserve">, not just the rows.</w:t>
+      </w:r>
+    </w:p>
+    <w:p>
+      <w:pPr>
+        <w:pStyle w:val="BodyText"/>
+      </w:pPr>
+      <w:r>
+        <w:t xml:space="preserve">✏️</w:t>
       </w:r>
       <w:r>
         <w:t xml:space="preserve"> </w:t>
@@ -3189,101 +3236,49 @@
           <w:b/>
           <w:bCs/>
         </w:rPr>
-        <w:t xml:space="preserve">other direction</w:t>
-      </w:r>
-      <w:r>
-        <w:t xml:space="preserve"> </w:t>
-      </w:r>
-      <w:r>
-        <w:t xml:space="preserve">— individuals on the left — and that the</w:t>
-      </w:r>
-      <w:r>
-        <w:t xml:space="preserve"> </w:t>
-      </w:r>
-      <w:r>
-        <w:rPr>
-          <w:rStyle w:val="VerbatimChar"/>
-        </w:rPr>
-        <w:t xml:space="preserve">by =</w:t>
-      </w:r>
-      <w:r>
-        <w:t xml:space="preserve"> </w:t>
-      </w:r>
-      <w:r>
-        <w:t xml:space="preserve">flips with it.</w:t>
-      </w:r>
-    </w:p>
-    <w:p>
-      <w:pPr>
-        <w:pStyle w:val="BodyText"/>
-      </w:pPr>
-      <w:r>
-        <w:t xml:space="preserve">✏️</w:t>
-      </w:r>
-      <w:r>
-        <w:t xml:space="preserve"> </w:t>
-      </w:r>
-      <w:r>
-        <w:rPr>
-          <w:b/>
-          <w:bCs/>
-        </w:rPr>
-        <w:t xml:space="preserve">Q14:</w:t>
-      </w:r>
-      <w:r>
-        <w:t xml:space="preserve"> </w:t>
-      </w:r>
-      <w:r>
-        <w:t xml:space="preserve">Capture events with no individual, and released fishers never recaptured. Were your predictions close?</w:t>
-      </w:r>
-    </w:p>
-    <w:p>
-      <w:pPr>
-        <w:pStyle w:val="BodyText"/>
-      </w:pPr>
-      <w:r>
-        <w:t xml:space="preserve">✏️</w:t>
-      </w:r>
-      <w:r>
-        <w:t xml:space="preserve"> </w:t>
-      </w:r>
-      <w:r>
-        <w:rPr>
-          <w:b/>
-          <w:bCs/>
-        </w:rPr>
         <w:t xml:space="preserve">Q15:</w:t>
       </w:r>
       <w:r>
         <w:t xml:space="preserve"> </w:t>
       </w:r>
       <w:r>
-        <w:t xml:space="preserve">Did</w:t>
-      </w:r>
-      <w:r>
-        <w:t xml:space="preserve"> </w:t>
-      </w:r>
-      <w:r>
-        <w:rPr>
-          <w:rStyle w:val="VerbatimChar"/>
-        </w:rPr>
-        <w:t xml:space="preserve">anti_join()</w:t>
-      </w:r>
-      <w:r>
-        <w:t xml:space="preserve"> </w:t>
-      </w:r>
-      <w:r>
-        <w:rPr>
-          <w:b/>
-          <w:bCs/>
-        </w:rPr>
-        <w:t xml:space="preserve">add</w:t>
-      </w:r>
-      <w:r>
-        <w:t xml:space="preserve"> </w:t>
-      </w:r>
-      <w:r>
-        <w:t xml:space="preserve">any columns, or only filter rows? Check the column names against the table you started from.</w:t>
+        <w:rPr>
+          <w:rStyle w:val="VerbatimChar"/>
+        </w:rPr>
+        <w:t xml:space="preserve">recaptured</w:t>
+      </w:r>
+      <w:r>
+        <w:t xml:space="preserve"> </w:t>
+      </w:r>
+      <w:r>
+        <w:t xml:space="preserve">rows +</w:t>
+      </w:r>
+      <w:r>
+        <w:t xml:space="preserve"> </w:t>
+      </w:r>
+      <w:r>
+        <w:rPr>
+          <w:rStyle w:val="VerbatimChar"/>
+        </w:rPr>
+        <w:t xml:space="preserve">never_seen</w:t>
+      </w:r>
+      <w:r>
+        <w:t xml:space="preserve"> </w:t>
+      </w:r>
+      <w:r>
+        <w:t xml:space="preserve">rows should equal</w:t>
+      </w:r>
+      <w:r>
+        <w:t xml:space="preserve"> </w:t>
+      </w:r>
+      <w:r>
+        <w:rPr>
+          <w:rStyle w:val="VerbatimChar"/>
+        </w:rPr>
+        <w:t xml:space="preserve">nrow(individuals_df)</w:t>
+      </w:r>
+      <w:r>
+        <w:t xml:space="preserve">. Does it? What would it mean if it did not?</w:t>
       </w:r>
     </w:p>
     <w:p>
@@ -3294,28 +3289,13 @@
       </w:r>
     </w:p>
     <w:bookmarkEnd w:id="40"/>
-    <w:bookmarkStart w:id="41" w:name="part-11-semi_join-keep-only-matches"/>
+    <w:bookmarkStart w:id="41" w:name="part-11-build-one-analysis-ready-table"/>
     <w:p>
       <w:pPr>
         <w:pStyle w:val="Heading1"/>
       </w:pPr>
       <w:r>
-        <w:t xml:space="preserve">Part 11 ·</w:t>
-      </w:r>
-      <w:r>
-        <w:t xml:space="preserve"> </w:t>
-      </w:r>
-      <w:r>
-        <w:rPr>
-          <w:rStyle w:val="VerbatimChar"/>
-        </w:rPr>
-        <w:t xml:space="preserve">semi_join()</w:t>
-      </w:r>
-      <w:r>
-        <w:t xml:space="preserve"> </w:t>
-      </w:r>
-      <w:r>
-        <w:t xml:space="preserve">— keep only matches</w:t>
+        <w:t xml:space="preserve">Part 11 · Build one analysis-ready table</w:t>
       </w:r>
     </w:p>
     <w:p>
@@ -3323,22 +3303,153 @@
         <w:pStyle w:val="FirstParagraph"/>
       </w:pPr>
       <w:r>
-        <w:t xml:space="preserve">Write the</w:t>
-      </w:r>
-      <w:r>
-        <w:t xml:space="preserve"> </w:t>
-      </w:r>
-      <w:r>
-        <w:rPr>
-          <w:rStyle w:val="VerbatimChar"/>
-        </w:rPr>
-        <w:t xml:space="preserve">semi_join()</w:t>
-      </w:r>
-      <w:r>
-        <w:t xml:space="preserve"> </w:t>
-      </w:r>
-      <w:r>
-        <w:t xml:space="preserve">that keeps the released fishers that</w:t>
+        <w:t xml:space="preserve">Write the pipe that</w:t>
+      </w:r>
+      <w:r>
+        <w:t xml:space="preserve"> </w:t>
+      </w:r>
+      <w:r>
+        <w:rPr>
+          <w:rStyle w:val="VerbatimChar"/>
+        </w:rPr>
+        <w:t xml:space="preserve">inner_join()</w:t>
+      </w:r>
+      <w:r>
+        <w:t xml:space="preserve">s the two tables,</w:t>
+      </w:r>
+      <w:r>
+        <w:t xml:space="preserve"> </w:t>
+      </w:r>
+      <w:r>
+        <w:rPr>
+          <w:rStyle w:val="VerbatimChar"/>
+        </w:rPr>
+        <w:t xml:space="preserve">mutate()</w:t>
+      </w:r>
+      <w:r>
+        <w:t xml:space="preserve">s a</w:t>
+      </w:r>
+      <w:r>
+        <w:t xml:space="preserve"> </w:t>
+      </w:r>
+      <w:r>
+        <w:rPr>
+          <w:rStyle w:val="VerbatimChar"/>
+        </w:rPr>
+        <w:t xml:space="preserve">days_since_release</w:t>
+      </w:r>
+      <w:r>
+        <w:t xml:space="preserve"> </w:t>
+      </w:r>
+      <w:r>
+        <w:t xml:space="preserve">column from the two dates, and</w:t>
+      </w:r>
+      <w:r>
+        <w:t xml:space="preserve"> </w:t>
+      </w:r>
+      <w:r>
+        <w:rPr>
+          <w:rStyle w:val="VerbatimChar"/>
+        </w:rPr>
+        <w:t xml:space="preserve">select()</w:t>
+      </w:r>
+      <w:r>
+        <w:t xml:space="preserve">s down to the columns worth keeping — renaming</w:t>
+      </w:r>
+      <w:r>
+        <w:t xml:space="preserve"> </w:t>
+      </w:r>
+      <w:r>
+        <w:rPr>
+          <w:rStyle w:val="VerbatimChar"/>
+        </w:rPr>
+        <w:t xml:space="preserve">site.x</w:t>
+      </w:r>
+      <w:r>
+        <w:t xml:space="preserve"> </w:t>
+      </w:r>
+      <w:r>
+        <w:t xml:space="preserve">to</w:t>
+      </w:r>
+      <w:r>
+        <w:t xml:space="preserve"> </w:t>
+      </w:r>
+      <w:r>
+        <w:rPr>
+          <w:rStyle w:val="VerbatimChar"/>
+        </w:rPr>
+        <w:t xml:space="preserve">capture_site</w:t>
+      </w:r>
+      <w:r>
+        <w:t xml:space="preserve"> </w:t>
+      </w:r>
+      <w:r>
+        <w:t xml:space="preserve">and</w:t>
+      </w:r>
+      <w:r>
+        <w:t xml:space="preserve"> </w:t>
+      </w:r>
+      <w:r>
+        <w:rPr>
+          <w:rStyle w:val="VerbatimChar"/>
+        </w:rPr>
+        <w:t xml:space="preserve">site.y</w:t>
+      </w:r>
+      <w:r>
+        <w:t xml:space="preserve"> </w:t>
+      </w:r>
+      <w:r>
+        <w:t xml:space="preserve">to</w:t>
+      </w:r>
+      <w:r>
+        <w:t xml:space="preserve"> </w:t>
+      </w:r>
+      <w:r>
+        <w:rPr>
+          <w:rStyle w:val="VerbatimChar"/>
+        </w:rPr>
+        <w:t xml:space="preserve">release_site</w:t>
+      </w:r>
+      <w:r>
+        <w:t xml:space="preserve"> </w:t>
+      </w:r>
+      <w:r>
+        <w:t xml:space="preserve">as you go. Then</w:t>
+      </w:r>
+      <w:r>
+        <w:t xml:space="preserve"> </w:t>
+      </w:r>
+      <w:r>
+        <w:rPr>
+          <w:rStyle w:val="VerbatimChar"/>
+        </w:rPr>
+        <w:t xml:space="preserve">write_csv()</w:t>
+      </w:r>
+      <w:r>
+        <w:t xml:space="preserve"> </w:t>
+      </w:r>
+      <w:r>
+        <w:t xml:space="preserve">it to</w:t>
+      </w:r>
+      <w:r>
+        <w:t xml:space="preserve"> </w:t>
+      </w:r>
+      <w:r>
+        <w:rPr>
+          <w:rStyle w:val="VerbatimChar"/>
+        </w:rPr>
+        <w:t xml:space="preserve">data/fisher_joined.csv</w:t>
+      </w:r>
+      <w:r>
+        <w:t xml:space="preserve">.</w:t>
+      </w:r>
+    </w:p>
+    <w:p>
+      <w:pPr>
+        <w:pStyle w:val="BodyText"/>
+      </w:pPr>
+      <w:r>
+        <w:t xml:space="preserve">✏️</w:t>
       </w:r>
       <w:r>
         <w:t xml:space="preserve"> </w:t>
@@ -3348,13 +3459,25 @@
           <w:b/>
           <w:bCs/>
         </w:rPr>
-        <w:t xml:space="preserve">were</w:t>
-      </w:r>
-      <w:r>
-        <w:t xml:space="preserve"> </w:t>
-      </w:r>
-      <w:r>
-        <w:t xml:space="preserve">recaptured at least once, and count them.</w:t>
+        <w:t xml:space="preserve">Q16:</w:t>
+      </w:r>
+      <w:r>
+        <w:t xml:space="preserve"> </w:t>
+      </w:r>
+      <w:r>
+        <w:t xml:space="preserve">Rows in your analysis table. Why is it smaller than</w:t>
+      </w:r>
+      <w:r>
+        <w:t xml:space="preserve"> </w:t>
+      </w:r>
+      <w:r>
+        <w:rPr>
+          <w:rStyle w:val="VerbatimChar"/>
+        </w:rPr>
+        <w:t xml:space="preserve">captures_df</w:t>
+      </w:r>
+      <w:r>
+        <w:t xml:space="preserve">?</w:t>
       </w:r>
     </w:p>
     <w:p>
@@ -3372,28 +3495,13 @@
           <w:b/>
           <w:bCs/>
         </w:rPr>
-        <w:t xml:space="preserve">Q16:</w:t>
-      </w:r>
-      <w:r>
-        <w:t xml:space="preserve"> </w:t>
-      </w:r>
-      <w:r>
-        <w:t xml:space="preserve">How is</w:t>
-      </w:r>
-      <w:r>
-        <w:t xml:space="preserve"> </w:t>
-      </w:r>
-      <w:r>
-        <w:rPr>
-          <w:rStyle w:val="VerbatimChar"/>
-        </w:rPr>
-        <w:t xml:space="preserve">semi_join()</w:t>
-      </w:r>
-      <w:r>
-        <w:t xml:space="preserve"> </w:t>
-      </w:r>
-      <w:r>
-        <w:t xml:space="preserve">different from</w:t>
+        <w:t xml:space="preserve">Q17:</w:t>
+      </w:r>
+      <w:r>
+        <w:t xml:space="preserve"> </w:t>
+      </w:r>
+      <w:r>
+        <w:t xml:space="preserve">Why</w:t>
       </w:r>
       <w:r>
         <w:t xml:space="preserve"> </w:t>
@@ -3405,7 +3513,22 @@
         <w:t xml:space="preserve">inner_join()</w:t>
       </w:r>
       <w:r>
-        <w:t xml:space="preserve">? Look at the</w:t>
+        <w:t xml:space="preserve"> </w:t>
+      </w:r>
+      <w:r>
+        <w:t xml:space="preserve">here, when Part 8 argued for</w:t>
+      </w:r>
+      <w:r>
+        <w:t xml:space="preserve"> </w:t>
+      </w:r>
+      <w:r>
+        <w:rPr>
+          <w:rStyle w:val="VerbatimChar"/>
+        </w:rPr>
+        <w:t xml:space="preserve">left_join()</w:t>
+      </w:r>
+      <w:r>
+        <w:t xml:space="preserve">? What is different about</w:t>
       </w:r>
       <w:r>
         <w:t xml:space="preserve"> </w:t>
@@ -3415,10 +3538,13 @@
           <w:b/>
           <w:bCs/>
         </w:rPr>
-        <w:t xml:space="preserve">columns</w:t>
-      </w:r>
-      <w:r>
-        <w:t xml:space="preserve">, not just the rows.</w:t>
+        <w:t xml:space="preserve">this</w:t>
+      </w:r>
+      <w:r>
+        <w:t xml:space="preserve"> </w:t>
+      </w:r>
+      <w:r>
+        <w:t xml:space="preserve">table’s job?</w:t>
       </w:r>
     </w:p>
     <w:p>
@@ -3436,49 +3562,41 @@
           <w:b/>
           <w:bCs/>
         </w:rPr>
-        <w:t xml:space="preserve">Q17:</w:t>
-      </w:r>
-      <w:r>
-        <w:t xml:space="preserve"> </w:t>
-      </w:r>
-      <w:r>
-        <w:rPr>
-          <w:rStyle w:val="VerbatimChar"/>
-        </w:rPr>
-        <w:t xml:space="preserve">recaptured</w:t>
-      </w:r>
-      <w:r>
-        <w:t xml:space="preserve"> </w:t>
-      </w:r>
-      <w:r>
-        <w:t xml:space="preserve">rows +</w:t>
-      </w:r>
-      <w:r>
-        <w:t xml:space="preserve"> </w:t>
-      </w:r>
-      <w:r>
-        <w:rPr>
-          <w:rStyle w:val="VerbatimChar"/>
-        </w:rPr>
-        <w:t xml:space="preserve">never_seen</w:t>
-      </w:r>
-      <w:r>
-        <w:t xml:space="preserve"> </w:t>
-      </w:r>
-      <w:r>
-        <w:t xml:space="preserve">rows should equal</w:t>
-      </w:r>
-      <w:r>
-        <w:t xml:space="preserve"> </w:t>
-      </w:r>
-      <w:r>
-        <w:rPr>
-          <w:rStyle w:val="VerbatimChar"/>
-        </w:rPr>
-        <w:t xml:space="preserve">nrow(individuals_df)</w:t>
-      </w:r>
-      <w:r>
-        <w:t xml:space="preserve">. Does it? What would it mean if it did not?</w:t>
+        <w:t xml:space="preserve">Q18:</w:t>
+      </w:r>
+      <w:r>
+        <w:t xml:space="preserve"> </w:t>
+      </w:r>
+      <w:r>
+        <w:t xml:space="preserve">Check the range of</w:t>
+      </w:r>
+      <w:r>
+        <w:t xml:space="preserve"> </w:t>
+      </w:r>
+      <w:r>
+        <w:rPr>
+          <w:rStyle w:val="VerbatimChar"/>
+        </w:rPr>
+        <w:t xml:space="preserve">days_since_release</w:t>
+      </w:r>
+      <w:r>
+        <w:t xml:space="preserve">. Are all the values positive? What would a</w:t>
+      </w:r>
+      <w:r>
+        <w:t xml:space="preserve"> </w:t>
+      </w:r>
+      <w:r>
+        <w:rPr>
+          <w:b/>
+          <w:bCs/>
+        </w:rPr>
+        <w:t xml:space="preserve">negative</w:t>
+      </w:r>
+      <w:r>
+        <w:t xml:space="preserve"> </w:t>
+      </w:r>
+      <w:r>
+        <w:t xml:space="preserve">value have told you about the data?</w:t>
       </w:r>
     </w:p>
     <w:p>
@@ -3489,325 +3607,7 @@
       </w:r>
     </w:p>
     <w:bookmarkEnd w:id="41"/>
-    <w:bookmarkStart w:id="42" w:name="part-12-build-one-analysis-ready-table"/>
-    <w:p>
-      <w:pPr>
-        <w:pStyle w:val="Heading1"/>
-      </w:pPr>
-      <w:r>
-        <w:t xml:space="preserve">Part 12 · Build one analysis-ready table</w:t>
-      </w:r>
-    </w:p>
-    <w:p>
-      <w:pPr>
-        <w:pStyle w:val="FirstParagraph"/>
-      </w:pPr>
-      <w:r>
-        <w:t xml:space="preserve">Write the pipe that</w:t>
-      </w:r>
-      <w:r>
-        <w:t xml:space="preserve"> </w:t>
-      </w:r>
-      <w:r>
-        <w:rPr>
-          <w:rStyle w:val="VerbatimChar"/>
-        </w:rPr>
-        <w:t xml:space="preserve">inner_join()</w:t>
-      </w:r>
-      <w:r>
-        <w:t xml:space="preserve">s the two tables,</w:t>
-      </w:r>
-      <w:r>
-        <w:t xml:space="preserve"> </w:t>
-      </w:r>
-      <w:r>
-        <w:rPr>
-          <w:rStyle w:val="VerbatimChar"/>
-        </w:rPr>
-        <w:t xml:space="preserve">mutate()</w:t>
-      </w:r>
-      <w:r>
-        <w:t xml:space="preserve">s a</w:t>
-      </w:r>
-      <w:r>
-        <w:t xml:space="preserve"> </w:t>
-      </w:r>
-      <w:r>
-        <w:rPr>
-          <w:rStyle w:val="VerbatimChar"/>
-        </w:rPr>
-        <w:t xml:space="preserve">days_since_release</w:t>
-      </w:r>
-      <w:r>
-        <w:t xml:space="preserve"> </w:t>
-      </w:r>
-      <w:r>
-        <w:t xml:space="preserve">column from the two dates, and</w:t>
-      </w:r>
-      <w:r>
-        <w:t xml:space="preserve"> </w:t>
-      </w:r>
-      <w:r>
-        <w:rPr>
-          <w:rStyle w:val="VerbatimChar"/>
-        </w:rPr>
-        <w:t xml:space="preserve">select()</w:t>
-      </w:r>
-      <w:r>
-        <w:t xml:space="preserve">s down to the columns worth keeping — renaming</w:t>
-      </w:r>
-      <w:r>
-        <w:t xml:space="preserve"> </w:t>
-      </w:r>
-      <w:r>
-        <w:rPr>
-          <w:rStyle w:val="VerbatimChar"/>
-        </w:rPr>
-        <w:t xml:space="preserve">site.x</w:t>
-      </w:r>
-      <w:r>
-        <w:t xml:space="preserve"> </w:t>
-      </w:r>
-      <w:r>
-        <w:t xml:space="preserve">to</w:t>
-      </w:r>
-      <w:r>
-        <w:t xml:space="preserve"> </w:t>
-      </w:r>
-      <w:r>
-        <w:rPr>
-          <w:rStyle w:val="VerbatimChar"/>
-        </w:rPr>
-        <w:t xml:space="preserve">capture_site</w:t>
-      </w:r>
-      <w:r>
-        <w:t xml:space="preserve"> </w:t>
-      </w:r>
-      <w:r>
-        <w:t xml:space="preserve">and</w:t>
-      </w:r>
-      <w:r>
-        <w:t xml:space="preserve"> </w:t>
-      </w:r>
-      <w:r>
-        <w:rPr>
-          <w:rStyle w:val="VerbatimChar"/>
-        </w:rPr>
-        <w:t xml:space="preserve">site.y</w:t>
-      </w:r>
-      <w:r>
-        <w:t xml:space="preserve"> </w:t>
-      </w:r>
-      <w:r>
-        <w:t xml:space="preserve">to</w:t>
-      </w:r>
-      <w:r>
-        <w:t xml:space="preserve"> </w:t>
-      </w:r>
-      <w:r>
-        <w:rPr>
-          <w:rStyle w:val="VerbatimChar"/>
-        </w:rPr>
-        <w:t xml:space="preserve">release_site</w:t>
-      </w:r>
-      <w:r>
-        <w:t xml:space="preserve"> </w:t>
-      </w:r>
-      <w:r>
-        <w:t xml:space="preserve">as you go. Then</w:t>
-      </w:r>
-      <w:r>
-        <w:t xml:space="preserve"> </w:t>
-      </w:r>
-      <w:r>
-        <w:rPr>
-          <w:rStyle w:val="VerbatimChar"/>
-        </w:rPr>
-        <w:t xml:space="preserve">write_csv()</w:t>
-      </w:r>
-      <w:r>
-        <w:t xml:space="preserve"> </w:t>
-      </w:r>
-      <w:r>
-        <w:t xml:space="preserve">it to</w:t>
-      </w:r>
-      <w:r>
-        <w:t xml:space="preserve"> </w:t>
-      </w:r>
-      <w:r>
-        <w:rPr>
-          <w:rStyle w:val="VerbatimChar"/>
-        </w:rPr>
-        <w:t xml:space="preserve">data/fisher_joined.csv</w:t>
-      </w:r>
-      <w:r>
-        <w:t xml:space="preserve">.</w:t>
-      </w:r>
-    </w:p>
-    <w:p>
-      <w:pPr>
-        <w:pStyle w:val="BodyText"/>
-      </w:pPr>
-      <w:r>
-        <w:t xml:space="preserve">✏️</w:t>
-      </w:r>
-      <w:r>
-        <w:t xml:space="preserve"> </w:t>
-      </w:r>
-      <w:r>
-        <w:rPr>
-          <w:b/>
-          <w:bCs/>
-        </w:rPr>
-        <w:t xml:space="preserve">Q18:</w:t>
-      </w:r>
-      <w:r>
-        <w:t xml:space="preserve"> </w:t>
-      </w:r>
-      <w:r>
-        <w:t xml:space="preserve">Rows in your analysis table. Why is it smaller than</w:t>
-      </w:r>
-      <w:r>
-        <w:t xml:space="preserve"> </w:t>
-      </w:r>
-      <w:r>
-        <w:rPr>
-          <w:rStyle w:val="VerbatimChar"/>
-        </w:rPr>
-        <w:t xml:space="preserve">captures_df</w:t>
-      </w:r>
-      <w:r>
-        <w:t xml:space="preserve">?</w:t>
-      </w:r>
-    </w:p>
-    <w:p>
-      <w:pPr>
-        <w:pStyle w:val="BodyText"/>
-      </w:pPr>
-      <w:r>
-        <w:t xml:space="preserve">✏️</w:t>
-      </w:r>
-      <w:r>
-        <w:t xml:space="preserve"> </w:t>
-      </w:r>
-      <w:r>
-        <w:rPr>
-          <w:b/>
-          <w:bCs/>
-        </w:rPr>
-        <w:t xml:space="preserve">Q19:</w:t>
-      </w:r>
-      <w:r>
-        <w:t xml:space="preserve"> </w:t>
-      </w:r>
-      <w:r>
-        <w:t xml:space="preserve">Why</w:t>
-      </w:r>
-      <w:r>
-        <w:t xml:space="preserve"> </w:t>
-      </w:r>
-      <w:r>
-        <w:rPr>
-          <w:rStyle w:val="VerbatimChar"/>
-        </w:rPr>
-        <w:t xml:space="preserve">inner_join()</w:t>
-      </w:r>
-      <w:r>
-        <w:t xml:space="preserve"> </w:t>
-      </w:r>
-      <w:r>
-        <w:t xml:space="preserve">here, when Part 9 argued for</w:t>
-      </w:r>
-      <w:r>
-        <w:t xml:space="preserve"> </w:t>
-      </w:r>
-      <w:r>
-        <w:rPr>
-          <w:rStyle w:val="VerbatimChar"/>
-        </w:rPr>
-        <w:t xml:space="preserve">left_join()</w:t>
-      </w:r>
-      <w:r>
-        <w:t xml:space="preserve">? What is different about</w:t>
-      </w:r>
-      <w:r>
-        <w:t xml:space="preserve"> </w:t>
-      </w:r>
-      <w:r>
-        <w:rPr>
-          <w:b/>
-          <w:bCs/>
-        </w:rPr>
-        <w:t xml:space="preserve">this</w:t>
-      </w:r>
-      <w:r>
-        <w:t xml:space="preserve"> </w:t>
-      </w:r>
-      <w:r>
-        <w:t xml:space="preserve">table’s job?</w:t>
-      </w:r>
-    </w:p>
-    <w:p>
-      <w:pPr>
-        <w:pStyle w:val="BodyText"/>
-      </w:pPr>
-      <w:r>
-        <w:t xml:space="preserve">✏️</w:t>
-      </w:r>
-      <w:r>
-        <w:t xml:space="preserve"> </w:t>
-      </w:r>
-      <w:r>
-        <w:rPr>
-          <w:b/>
-          <w:bCs/>
-        </w:rPr>
-        <w:t xml:space="preserve">Q20:</w:t>
-      </w:r>
-      <w:r>
-        <w:t xml:space="preserve"> </w:t>
-      </w:r>
-      <w:r>
-        <w:t xml:space="preserve">Check the range of</w:t>
-      </w:r>
-      <w:r>
-        <w:t xml:space="preserve"> </w:t>
-      </w:r>
-      <w:r>
-        <w:rPr>
-          <w:rStyle w:val="VerbatimChar"/>
-        </w:rPr>
-        <w:t xml:space="preserve">days_since_release</w:t>
-      </w:r>
-      <w:r>
-        <w:t xml:space="preserve">. Are all the values positive? What would a</w:t>
-      </w:r>
-      <w:r>
-        <w:t xml:space="preserve"> </w:t>
-      </w:r>
-      <w:r>
-        <w:rPr>
-          <w:b/>
-          <w:bCs/>
-        </w:rPr>
-        <w:t xml:space="preserve">negative</w:t>
-      </w:r>
-      <w:r>
-        <w:t xml:space="preserve"> </w:t>
-      </w:r>
-      <w:r>
-        <w:t xml:space="preserve">value have told you about the data?</w:t>
-      </w:r>
-    </w:p>
-    <w:p>
-      <w:r>
-        <w:pict>
-          <v:rect style="width:0;height:1.5pt" o:hralign="center" o:hrstd="t" o:hr="t"/>
-        </w:pict>
-      </w:r>
-    </w:p>
-    <w:bookmarkEnd w:id="42"/>
-    <w:bookmarkStart w:id="47" w:name="Xadef2740ba7a0aaeb437aa25735a04c51b58879"/>
+    <w:bookmarkStart w:id="46" w:name="Xadef2740ba7a0aaeb437aa25735a04c51b58879"/>
     <w:p>
       <w:pPr>
         <w:pStyle w:val="Heading1"/>
@@ -3857,7 +3657,7 @@
         <w:t xml:space="preserve">comments.</w:t>
       </w:r>
     </w:p>
-    <w:bookmarkStart w:id="43" w:name="h1-summarize-the-joined-table"/>
+    <w:bookmarkStart w:id="42" w:name="h1-summarize-the-joined-table"/>
     <w:p>
       <w:pPr>
         <w:pStyle w:val="Heading2"/>
@@ -4057,8 +3857,8 @@
         <w:t xml:space="preserve">spent their time? Say which, and how you would tell the two apart.</w:t>
       </w:r>
     </w:p>
-    <w:bookmarkEnd w:id="43"/>
-    <w:bookmarkStart w:id="44" w:name="h2-recaptures-per-fisher"/>
+    <w:bookmarkEnd w:id="42"/>
+    <w:bookmarkStart w:id="43" w:name="h2-recaptures-per-fisher"/>
     <w:p>
       <w:pPr>
         <w:pStyle w:val="Heading2"/>
@@ -4115,8 +3915,8 @@
         <w:t xml:space="preserve">The most-recaptured fisher and its count, and how many fishers were caught exactly once.</w:t>
       </w:r>
     </w:p>
-    <w:bookmarkEnd w:id="44"/>
-    <w:bookmarkStart w:id="45" w:name="h3-join-in-a-table-of-your-own"/>
+    <w:bookmarkEnd w:id="43"/>
+    <w:bookmarkStart w:id="44" w:name="h3-join-in-a-table-of-your-own"/>
     <w:p>
       <w:pPr>
         <w:pStyle w:val="Heading2"/>
@@ -4238,8 +4038,8 @@
         <w:t xml:space="preserve">from your new column, and is that a problem or exactly what you asked for?</w:t>
       </w:r>
     </w:p>
-    <w:bookmarkEnd w:id="45"/>
-    <w:bookmarkStart w:id="46" w:name="h4-the-thing-that-surprised-you"/>
+    <w:bookmarkEnd w:id="44"/>
+    <w:bookmarkStart w:id="45" w:name="h4-the-thing-that-surprised-you"/>
     <w:p>
       <w:pPr>
         <w:pStyle w:val="Heading2"/>
@@ -4307,9 +4107,9 @@
         </w:pict>
       </w:r>
     </w:p>
+    <w:bookmarkEnd w:id="45"/>
     <w:bookmarkEnd w:id="46"/>
-    <w:bookmarkEnd w:id="47"/>
-    <w:bookmarkStart w:id="48" w:name="review-and-checkpoint"/>
+    <w:bookmarkStart w:id="47" w:name="review-and-checkpoint"/>
     <w:p>
       <w:pPr>
         <w:pStyle w:val="Heading1"/>
@@ -4463,27 +4263,6 @@
     </w:p>
     <w:p>
       <w:pPr>
-        <w:pStyle w:val="Compact"/>
-        <w:numPr>
-          <w:ilvl w:val="0"/>
-          <w:numId w:val="1011"/>
-        </w:numPr>
-      </w:pPr>
-      <w:r>
-        <w:t xml:space="preserve">Recognize the accidental-</w:t>
-      </w:r>
-      <w:r>
-        <w:rPr>
-          <w:rStyle w:val="VerbatimChar"/>
-        </w:rPr>
-        <w:t xml:space="preserve">site</w:t>
-      </w:r>
-      <w:r>
-        <w:t xml:space="preserve">-join bug from the message dplyr prints</w:t>
-      </w:r>
-    </w:p>
-    <w:p>
-      <w:pPr>
         <w:pStyle w:val="FirstParagraph"/>
       </w:pPr>
       <w:r>
@@ -4585,7 +4364,7 @@
         <w:t xml:space="preserve">End of Activity 16. Next: a week off, then one-way ANOVA.</w:t>
       </w:r>
     </w:p>
-    <w:bookmarkEnd w:id="48"/>
+    <w:bookmarkEnd w:id="47"/>
     <w:sectPr>
       <w:pgSz w:h="15840" w:w="12240"/>
       <w:pgMar w:bottom="720" w:footer="432" w:gutter="0" w:header="432" w:left="720" w:right="1008" w:top="720"/>
@@ -5046,9 +4825,6 @@
     <w:abstractNumId w:val="992"/>
   </w:num>
   <w:num w:numId="1010">
-    <w:abstractNumId w:val="992"/>
-  </w:num>
-  <w:num w:numId="1011">
     <w:abstractNumId w:val="992"/>
   </w:num>
 </w:numbering>

</xml_diff>